<commit_message>
docs(qms): finding 6 — completed findings-sheet row and evidence pack
- OFI-2026-06_Findings_Sheet_Row_6.xlsx: row 6 in the MQAS sheet's
  column order (A–T); auditee columns J–N filled (J–M as approved in
  AR-2026-008; N = verification done and effectiveness checks planned);
  MQAS columns O–T left blank
- OFI-2026-06_Finding_6_Evidence_Pack.zip: sheet row, response, EM26-35,
  SOP-05 rev 1.2, REG-03, REG-04, AR-2026-008 (Word) + README index
- REG-04 OFI-2026-06: response row and pack recorded

Co-Authored-By: Claude Opus 5.5 <noreply@anthropic.com>
</commit_message>
<xml_diff>
--- a/docs/qms/evidence-2026/QMS_Word/registers__REG-04_Nonconformity_and_CAPA_Log.docx
+++ b/docs/qms/evidence-2026/QMS_Word/registers__REG-04_Nonconformity_and_CAPA_Log.docx
@@ -16501,13 +16501,33 @@
             </w:pPr>
             <w:r>
               <w:rPr/>
-              <w:t>Findings sheet columns J–M — due 2026-10-22 (</w:t>
+              <w:t xml:space="preserve">Findings sheet columns J–N — due 2026-10-22. Response </w:t>
             </w:r>
             <w:r>
               <w:rPr>
                 <w:rStyle w:val="SourceText"/>
               </w:rPr>
               <w:t>evidence-2026/20_AI_Impact_Assessment/OFI-2026-06_Response_Finding_6.docx</w:t>
+            </w:r>
+            <w:r>
+              <w:rPr/>
+              <w:t>; completed sheet row and evidence pack prepared 2026-10-23 (</w:t>
+            </w:r>
+            <w:r>
+              <w:rPr>
+                <w:rStyle w:val="SourceText"/>
+              </w:rPr>
+              <w:t>OFI-2026-06_Findings_Sheet_Row_6.xlsx</w:t>
+            </w:r>
+            <w:r>
+              <w:rPr/>
+              <w:t xml:space="preserve">, </w:t>
+            </w:r>
+            <w:r>
+              <w:rPr>
+                <w:rStyle w:val="SourceText"/>
+              </w:rPr>
+              <w:t>OFI-2026-06_Finding_6_Evidence_Pack.zip</w:t>
             </w:r>
             <w:r>
               <w:rPr/>

</xml_diff>